<commit_message>
Match hub rebuild copy to Trillet voice
Fix three lines that drifted into blog register: replace the 'behind the glass'
metaphor with the live page's plainer 'clients never see Trillet', change the
compliance header from a clever line to a plain label, and restore the 'high-stakes
conversations' brand phrase in the hero subhead.

Co-Authored-By: Claude Opus 4.8 <noreply@anthropic.com>
Claude-Session: https://claude.ai/code/session_01UhVChLeNNjFDr6eASTMGhh
</commit_message>
<xml_diff>
--- a/seo-audit/Trillet-Whitelabel-Hub-Rebuild.docx
+++ b/seo-audit/Trillet-Whitelabel-Hub-Rebuild.docx
@@ -785,7 +785,7 @@
           <w:sz w:val="19"/>
           <w:szCs w:val="19"/>
         </w:rPr>
-        <w:t xml:space="preserve">Sell voice agents your clients believe you built. Your domain, your dashboard, your pricing. Trillet stays behind the glass, and the compliance comes with it.</w:t>
+        <w:t xml:space="preserve">Sell voice agents your clients believe you built. Your domain, your dashboard, your pricing. Clients log in to your product and never see Trillet, and the compliance for high-stakes conversations comes built in.</w:t>
       </w:r>
     </w:p>
     <w:p>
@@ -1274,7 +1274,7 @@
           <w:sz w:val="20"/>
           <w:szCs w:val="20"/>
         </w:rPr>
-        <w:t xml:space="preserve">H2:  The part most platforms sell you later</w:t>
+        <w:t xml:space="preserve">H2:  Compliance, built in, not billed later</w:t>
       </w:r>
     </w:p>
     <w:p>

</xml_diff>

<commit_message>
Finalize /whitelabel hub: team voice, buyer checklist, definition to FAQ
Rewrite the hub in the Trillet team's first-person voice with earned authority
(we build it, we have sold it). Remove the naive 'what is white-label voice AI'
body block and fold the definition into the FAQ where it belongs. Add a buyer's
checklist section grounded in evaluation intent and the competitor review, with
compliance framed as a buying criterion. Enrich the feature descriptions with
concrete detail, and correct the meta-description length label to 144.

Co-Authored-By: Claude Opus 4.8 <noreply@anthropic.com>
Claude-Session: https://claude.ai/code/session_01UhVChLeNNjFDr6eASTMGhh
</commit_message>
<xml_diff>
--- a/seo-audit/Trillet-Whitelabel-Hub-Rebuild.docx
+++ b/seo-audit/Trillet-Whitelabel-Hub-Rebuild.docx
@@ -16,7 +16,7 @@
           <w:sz w:val="15"/>
           <w:szCs w:val="15"/>
         </w:rPr>
-        <w:t xml:space="preserve">TRILLET · HUB REBUILD DRAFT · /WHITELABEL</w:t>
+        <w:t xml:space="preserve">TRILLET · HUB REBUILD · FINAL · /WHITELABEL</w:t>
       </w:r>
     </w:p>
     <w:p>
@@ -50,7 +50,7 @@
           <w:sz w:val="18"/>
           <w:szCs w:val="18"/>
         </w:rPr>
-        <w:t xml:space="preserve">This is a copy-and-structure draft for the flagship hub, </w:t>
+        <w:t xml:space="preserve">Final copy-and-structure draft for the flagship hub, </w:t>
       </w:r>
       <w:r>
         <w:rPr>
@@ -76,7 +76,7 @@
           <w:sz w:val="18"/>
           <w:szCs w:val="18"/>
         </w:rPr>
-        <w:t xml:space="preserve">. It keeps what the live page already does well and closes the gaps that hold the head term back: a plain-language answer block for people and AI engines, sharper head-term targeting, and the compliance wedge pulled to the front. Every figure below is reconciled to the live page as of September 2026.</w:t>
+        <w:t xml:space="preserve">. It keeps what the live page does well and closes the gaps that hold the head term back: sharper head-term targeting, the compliance wedge pulled to the front, a buyer's checklist that matches how agencies actually evaluate, and language that reads as the Trillet team speaking, not a brochure. Every figure is reconciled to the live page as of September 2026.</w:t>
       </w:r>
     </w:p>
     <w:p>
@@ -249,7 +249,7 @@
           <w:sz w:val="17"/>
           <w:szCs w:val="17"/>
         </w:rPr>
-        <w:t xml:space="preserve">Founder first person where it earns it, plain and declarative elsewhere. No hype, Australian spelling, zero em-dashes.</w:t>
+        <w:t xml:space="preserve">The Trillet team, first person plural, with earned authority: we build the platform and we have sold voice AI ourselves. Plain and declarative, no hype, Australian spelling, zero em-dashes.</w:t>
       </w:r>
     </w:p>
     <w:p>
@@ -301,7 +301,7 @@
           <w:sz w:val="16"/>
           <w:szCs w:val="16"/>
         </w:rPr>
-        <w:t xml:space="preserve">Render the page server-side. The head term will not rank if the H1, the answer block and the copy load only after JavaScript. Verify the raw HTML source carries the text.</w:t>
+        <w:t xml:space="preserve">Render the page server-side. The head term will not rank if the H1 and the copy load only after JavaScript. Verify the raw HTML source carries the text.</w:t>
       </w:r>
     </w:p>
     <w:p>
@@ -326,7 +326,7 @@
           <w:sz w:val="16"/>
           <w:szCs w:val="16"/>
         </w:rPr>
-        <w:t xml:space="preserve">New meta description below is 152 characters. The live one is 186 and gets truncated in results. Swap it.</w:t>
+        <w:t xml:space="preserve">New meta description below is 144 characters. The live one is 186 and gets truncated in results. Swap it.</w:t>
       </w:r>
     </w:p>
     <w:p>
@@ -552,7 +552,7 @@
           <w:sz w:val="16"/>
           <w:szCs w:val="16"/>
         </w:rPr>
-        <w:t xml:space="preserve">White-label voice AI you sell under your own brand. Full branding, isolated client workspaces, and compliance built in, not billed as an add-on.  (152)</w:t>
+        <w:t xml:space="preserve">White-label voice AI you sell under your own brand. Full branding, isolated client workspaces, and compliance built in, not billed as an add-on.  (144)</w:t>
       </w:r>
     </w:p>
     <w:p>
@@ -570,7 +570,7 @@
           <w:sz w:val="17"/>
           <w:szCs w:val="17"/>
         </w:rPr>
-        <w:t xml:space="preserve">Leads with the head term, states the branding and multi-tenancy the buyer is scanning for, and ends on the compliance wedge that separates Trillet from the roundup pages. Under the truncation limit.</w:t>
+        <w:t xml:space="preserve">Leads with the head term, states the branding and multi-tenancy the buyer is scanning for, and ends on the compliance wedge that separates us from the roundup pages. Under the truncation limit.</w:t>
       </w:r>
     </w:p>
     <w:p>
@@ -615,7 +615,7 @@
           <w:sz w:val="18"/>
           <w:szCs w:val="18"/>
         </w:rPr>
-        <w:t xml:space="preserve">The live page already flows well: hero, feature grid, build demo, margins, verticals, pricing, proof, support, FAQ, close. The rebuild keeps that spine and makes four changes: a tighter H1, a plain-language answer block directly under the hero, question-format headings where they earn a snippet, and the compliance section pulled up so it reads as a reason to choose Trillet rather than fine print at the foot.</w:t>
+        <w:t xml:space="preserve">The live page already flows well: hero, feature grid, build demo, margins, verticals, pricing, proof, support, FAQ, close. This final keeps that spine and makes four changes: a tighter, head-term H1; the compliance section pulled up so it reads as a reason to choose us rather than fine print at the foot; a new buyer's checklist that meets the visitor mid-evaluation; and the whole page rewritten in the team's voice. The old “what is white-label voice AI” explainer is gone from the body, where it read like filler, and now lives as the first FAQ, where a definition belongs.</w:t>
       </w:r>
     </w:p>
     <w:p>
@@ -785,7 +785,7 @@
           <w:sz w:val="19"/>
           <w:szCs w:val="19"/>
         </w:rPr>
-        <w:t xml:space="preserve">Sell voice agents your clients believe you built. Your domain, your dashboard, your pricing. Clients log in to your product and never see Trillet, and the compliance for high-stakes conversations comes built in.</w:t>
+        <w:t xml:space="preserve">Sell voice agents your clients believe you built. Your domain, your dashboard, your pricing. Clients log in to your product and never see us, and the compliance that high-stakes conversations demand is already in the box.</w:t>
       </w:r>
     </w:p>
     <w:p>
@@ -859,7 +859,23 @@
           <w:sz w:val="14"/>
           <w:szCs w:val="14"/>
         </w:rPr>
-        <w:t xml:space="preserve">SECTION 2 · ANSWER BLOCK  (NEW)</w:t>
+        <w:t xml:space="preserve">SECTION 2 · WHAT YOU GET  (FEATURE GRID, KEEP, ENRICHED)</w:t>
+      </w:r>
+    </w:p>
+    <w:p>
+      <w:pPr>
+        <w:spacing w:after="16" w:before="110"/>
+      </w:pPr>
+      <w:r>
+        <w:rPr>
+          <w:rFonts w:ascii="Calibri" w:cs="Calibri" w:eastAsia="Calibri" w:hAnsi="Calibri"/>
+          <w:b/>
+          <w:bCs/>
+          <w:color w:val="16223C"/>
+          <w:sz w:val="20"/>
+          <w:szCs w:val="20"/>
+        </w:rPr>
+        <w:t xml:space="preserve">H2:  Everything you need to deliver under your brand</w:t>
       </w:r>
     </w:p>
     <w:p>
@@ -877,137 +893,7 @@
           <w:sz w:val="18"/>
           <w:szCs w:val="18"/>
         </w:rPr>
-        <w:t xml:space="preserve">The single biggest gap on the live page. There is no plain sentence defining the term, so neither a first-time visitor nor an AI answer engine gets a clean definition to lift. Add this directly under the hero, as visible body text, not a tooltip.</w:t>
-      </w:r>
-    </w:p>
-    <w:tbl>
-      <w:tblPr>
-        <w:tblW w:type="dxa" w:w="9360"/>
-        <w:tblBorders>
-          <w:top w:val="none"/>
-          <w:left w:val="single" w:color="2E7D5B" w:sz="18"/>
-          <w:bottom w:val="none"/>
-          <w:right w:val="none"/>
-          <w:insideH w:val="single" w:color="auto" w:sz="4"/>
-          <w:insideV w:val="single" w:color="auto" w:sz="4"/>
-        </w:tblBorders>
-      </w:tblPr>
-      <w:tblGrid>
-        <w:gridCol w:w="9360"/>
-      </w:tblGrid>
-      <w:tr>
-        <w:tc>
-          <w:tcPr>
-            <w:tcW w:type="dxa" w:w="9360"/>
-            <w:tcBorders>
-              <w:top w:val="none"/>
-              <w:left w:val="single" w:color="2E7D5B" w:sz="18"/>
-              <w:bottom w:val="none"/>
-              <w:right w:val="none"/>
-            </w:tcBorders>
-            <w:shd w:fill="EEF3F0" w:color="auto" w:val="clear"/>
-            <w:tcMar>
-              <w:top w:type="dxa" w:w="110"/>
-              <w:left w:type="dxa" w:w="150"/>
-              <w:bottom w:type="dxa" w:w="110"/>
-              <w:right w:type="dxa" w:w="150"/>
-            </w:tcMar>
-          </w:tcPr>
-          <w:p>
-            <w:pPr>
-              <w:spacing w:after="0" w:line="276"/>
-            </w:pPr>
-            <w:r>
-              <w:rPr>
-                <w:rFonts w:ascii="Calibri" w:cs="Calibri" w:eastAsia="Calibri" w:hAnsi="Calibri"/>
-                <w:b/>
-                <w:bCs/>
-                <w:color w:val="16223C"/>
-                <w:sz w:val="20"/>
-                <w:szCs w:val="20"/>
-              </w:rPr>
-              <w:t xml:space="preserve">What is white-label voice AI? </w:t>
-            </w:r>
-            <w:r>
-              <w:rPr>
-                <w:rFonts w:ascii="Calibri" w:cs="Calibri" w:eastAsia="Calibri" w:hAnsi="Calibri"/>
-                <w:color w:val="24303F"/>
-                <w:sz w:val="20"/>
-                <w:szCs w:val="20"/>
-              </w:rPr>
-              <w:t xml:space="preserve">White-label voice AI is a voice agent platform you resell under your own brand. You buy access at a wholesale rate, put your name, domain and dashboard on it, set your own price, and own the client. The vendor runs the software and stays invisible. Trillet adds the part most platforms treat as an upsell: compliance and a verifiable record of every call, built in.</w:t>
-            </w:r>
-          </w:p>
-        </w:tc>
-      </w:tr>
-    </w:tbl>
-    <w:p>
-      <w:pPr>
-        <w:spacing w:after="110" w:line="278"/>
-      </w:pPr>
-      <w:r>
-        <w:rPr>
-          <w:rFonts w:ascii="Calibri" w:cs="Calibri" w:eastAsia="Calibri" w:hAnsi="Calibri"/>
-          <w:b w:val="false"/>
-          <w:bCs w:val="false"/>
-          <w:i w:val="false"/>
-          <w:iCs w:val="false"/>
-          <w:color w:val="5A6675"/>
-          <w:sz w:val="17"/>
-          <w:szCs w:val="17"/>
-        </w:rPr>
-        <w:t xml:space="preserve">Keep it to those few sentences. It answers the query, seeds the head term and the LSI, and gives an AI engine something quotable with Trillet named in it.</w:t>
-      </w:r>
-    </w:p>
-    <w:p>
-      <w:pPr>
-        <w:spacing w:after="30" w:before="120"/>
-      </w:pPr>
-      <w:r>
-        <w:rPr>
-          <w:rFonts w:ascii="Consolas" w:cs="Consolas" w:eastAsia="Consolas" w:hAnsi="Consolas"/>
-          <w:b/>
-          <w:bCs/>
-          <w:color w:val="9A6B3F"/>
-          <w:spacing w:val="12"/>
-          <w:sz w:val="14"/>
-          <w:szCs w:val="14"/>
-        </w:rPr>
-        <w:t xml:space="preserve">SECTION 3 · WHAT YOU GET  (FEATURE GRID, KEEP)</w:t>
-      </w:r>
-    </w:p>
-    <w:p>
-      <w:pPr>
-        <w:spacing w:after="16" w:before="110"/>
-      </w:pPr>
-      <w:r>
-        <w:rPr>
-          <w:rFonts w:ascii="Calibri" w:cs="Calibri" w:eastAsia="Calibri" w:hAnsi="Calibri"/>
-          <w:b/>
-          <w:bCs/>
-          <w:color w:val="16223C"/>
-          <w:sz w:val="20"/>
-          <w:szCs w:val="20"/>
-        </w:rPr>
-        <w:t xml:space="preserve">H2:  Everything you need to deliver under your brand</w:t>
-      </w:r>
-    </w:p>
-    <w:p>
-      <w:pPr>
-        <w:spacing w:after="110" w:line="278"/>
-      </w:pPr>
-      <w:r>
-        <w:rPr>
-          <w:rFonts w:ascii="Calibri" w:cs="Calibri" w:eastAsia="Calibri" w:hAnsi="Calibri"/>
-          <w:b w:val="false"/>
-          <w:bCs w:val="false"/>
-          <w:i w:val="false"/>
-          <w:iCs w:val="false"/>
-          <w:color w:val="24303F"/>
-          <w:sz w:val="18"/>
-          <w:szCs w:val="18"/>
-        </w:rPr>
-        <w:t xml:space="preserve">The live grid is good. Keep the six cards, tighten the copy, and make sure each card name carries an entity a buyer or an engine would search.</w:t>
+        <w:t xml:space="preserve">The live grid is good. Keep the six cards, tighten the copy, and describe each one concretely enough that a buyer can picture it, not just skim a label.</w:t>
       </w:r>
     </w:p>
     <w:p>
@@ -1043,7 +929,7 @@
           <w:sz w:val="20"/>
           <w:szCs w:val="20"/>
         </w:rPr>
-        <w:t xml:space="preserve">Your domain, your dashboard, your billing. Clients log in to your product and never see Trillet.</w:t>
+        <w:t xml:space="preserve">Your domain, your dashboard, your billing, on app.youragency.com. Clients log in to your product; our name is nowhere in it.</w:t>
       </w:r>
     </w:p>
     <w:p>
@@ -1079,7 +965,7 @@
           <w:sz w:val="20"/>
           <w:szCs w:val="20"/>
         </w:rPr>
-        <w:t xml:space="preserve">Every client runs in an isolated workspace, managed centrally from one dashboard.</w:t>
+        <w:t xml:space="preserve">Every client sits in its own isolated workspace with its own data, agents and numbers, and you manage all of them from one place. One client's calls, prompts and records never touch another's.</w:t>
       </w:r>
     </w:p>
     <w:p>
@@ -1115,7 +1001,7 @@
           <w:sz w:val="20"/>
           <w:szCs w:val="20"/>
         </w:rPr>
-        <w:t xml:space="preserve">From a client's website to a live, trained agent in minutes.</w:t>
+        <w:t xml:space="preserve">Paste a client's website and we build a trained agent from it in minutes, branded as yours and ready to take calls.</w:t>
       </w:r>
     </w:p>
     <w:p>
@@ -1151,7 +1037,7 @@
           <w:sz w:val="20"/>
           <w:szCs w:val="20"/>
         </w:rPr>
-        <w:t xml:space="preserve">Vertical playbooks for reception, booking and intake, so you are not building each agent from scratch.</w:t>
+        <w:t xml:space="preserve">Pre-built agents for reception, qualification, booking and follow-up, so you launch from a working starting point instead of a blank canvas.</w:t>
       </w:r>
     </w:p>
     <w:p>
@@ -1187,7 +1073,7 @@
           <w:sz w:val="20"/>
           <w:szCs w:val="20"/>
         </w:rPr>
-        <w:t xml:space="preserve">GoHighLevel, Google Calendar and Cal.com out of the box, with webhook and API paths for the rest.</w:t>
+        <w:t xml:space="preserve">GoHighLevel, Google Calendar and Cal.com out of the box, with webhook and API paths for the rest. No custom development for the common cases.</w:t>
       </w:r>
     </w:p>
     <w:p>
@@ -1223,7 +1109,7 @@
           <w:sz w:val="20"/>
           <w:szCs w:val="20"/>
         </w:rPr>
-        <w:t xml:space="preserve">Call volumes, bookings and outcomes your clients see under your brand.</w:t>
+        <w:t xml:space="preserve">Call volumes, bookings and answer rates your clients see in a report that carries your brand, not ours.</w:t>
       </w:r>
     </w:p>
     <w:p>
@@ -1240,7 +1126,7 @@
           <w:sz w:val="14"/>
           <w:szCs w:val="14"/>
         </w:rPr>
-        <w:t xml:space="preserve">SECTION 4 · WHY COMPLIANCE IS THE WEDGE  (PULL UP FROM THE FOOT)</w:t>
+        <w:t xml:space="preserve">SECTION 3 · WHY COMPLIANCE IS THE WEDGE  (PULL UP FROM THE FOOT)</w:t>
       </w:r>
     </w:p>
     <w:p>
@@ -1292,7 +1178,7 @@
           <w:sz w:val="20"/>
           <w:szCs w:val="20"/>
         </w:rPr>
-        <w:t xml:space="preserve">Put your brand on an AI that talks to a client's customers and you inherit the liability. Most white-label platforms leave you to sort that out. Trillet builds it in. Every client workspace keeps full audit trails and role-based access. Recordings, transcripts and backups are retained, and stored onshore for clients who mandate it, so a disputed call is something you open rather than argue about.</w:t>
+        <w:t xml:space="preserve">We built Trillet around the part most platforms treat as an upsell. Put your brand on an AI that talks to a client's customers and you inherit the liability, and we have been on that side of it ourselves. So we made compliance and the call record part of the platform rather than a line item. Every client workspace keeps full audit trails and role-based access, and recordings, transcripts and backups are retained and stored onshore for clients who mandate it. When a call is disputed, you open the record and read it back, you do not guess.</w:t>
       </w:r>
     </w:p>
     <w:p>
@@ -1310,7 +1196,7 @@
           <w:sz w:val="20"/>
           <w:szCs w:val="20"/>
         </w:rPr>
-        <w:t xml:space="preserve">The certifications are the platform's, not an add-on you pay for: SOC 2 Type II, ISO 27001, and operation under HIPAA, GDPR, ACMA and TCPA. On-premise and private cloud are available for enterprise clients, and the company is Australian owned with data residency to match. If your clients are clinics, law firms or financial services, this is what lets you sell to them at all.</w:t>
+        <w:t xml:space="preserve">The certifications are ours, on every workspace, not an add-on you unlock later: SOC 2 Type II, ISO 27001, and operation under HIPAA, GDPR, ACMA and TCPA. On-premise and private cloud are available for enterprise clients, and we are Australian owned with data residency to match. If your clients are clinics, law firms or financial services, this is what lets you sell to them at all.</w:t>
       </w:r>
     </w:p>
     <w:p>
@@ -1358,6 +1244,305 @@
           <w:sz w:val="14"/>
           <w:szCs w:val="14"/>
         </w:rPr>
+        <w:t xml:space="preserve">SECTION 4 · BUYER'S CHECKLIST  (NEW, HELPFUL)</w:t>
+      </w:r>
+    </w:p>
+    <w:p>
+      <w:pPr>
+        <w:spacing w:after="110" w:line="278"/>
+      </w:pPr>
+      <w:r>
+        <w:rPr>
+          <w:rFonts w:ascii="Calibri" w:cs="Calibri" w:eastAsia="Calibri" w:hAnsi="Calibri"/>
+          <w:b w:val="false"/>
+          <w:bCs w:val="false"/>
+          <w:i w:val="false"/>
+          <w:iCs w:val="false"/>
+          <w:color w:val="5A6675"/>
+          <w:sz w:val="17"/>
+          <w:szCs w:val="17"/>
+        </w:rPr>
+        <w:t xml:space="preserve">New section, and the one that meets the visitor where they actually are: mid-evaluation, comparing a shortlist. It is genuinely useful, it earns an AEO snippet, and it lets our compliance advantage land as a buying criterion rather than a boast. Grounded in the competitor review, where compliance is where the field really splits.</w:t>
+      </w:r>
+    </w:p>
+    <w:p>
+      <w:pPr>
+        <w:spacing w:after="16" w:before="110"/>
+      </w:pPr>
+      <w:r>
+        <w:rPr>
+          <w:rFonts w:ascii="Calibri" w:cs="Calibri" w:eastAsia="Calibri" w:hAnsi="Calibri"/>
+          <w:b/>
+          <w:bCs/>
+          <w:color w:val="16223C"/>
+          <w:sz w:val="20"/>
+          <w:szCs w:val="20"/>
+        </w:rPr>
+        <w:t xml:space="preserve">H2:  What to check before you put your name on a voice AI platform</w:t>
+      </w:r>
+    </w:p>
+    <w:p>
+      <w:pPr>
+        <w:spacing w:after="110" w:line="278"/>
+      </w:pPr>
+      <w:r>
+        <w:rPr>
+          <w:rFonts w:ascii="Calibri" w:cs="Calibri" w:eastAsia="Calibri" w:hAnsi="Calibri"/>
+          <w:b w:val="false"/>
+          <w:bCs w:val="false"/>
+          <w:i w:val="false"/>
+          <w:iCs w:val="false"/>
+          <w:color w:val="24303F"/>
+          <w:sz w:val="20"/>
+          <w:szCs w:val="20"/>
+        </w:rPr>
+        <w:t xml:space="preserve">We have sold voice AI through other people's platforms and we now build our own, so here is the checklist we would actually use. Run any platform through these five checks, ours included.</w:t>
+      </w:r>
+    </w:p>
+    <w:p>
+      <w:pPr>
+        <w:pStyle w:val="ListParagraph"/>
+        <w:numPr>
+          <w:ilvl w:val="0"/>
+          <w:numId w:val="1"/>
+        </w:numPr>
+        <w:spacing w:after="50" w:line="272"/>
+      </w:pPr>
+      <w:r>
+        <w:rPr>
+          <w:rFonts w:ascii="Calibri" w:cs="Calibri" w:eastAsia="Calibri" w:hAnsi="Calibri"/>
+          <w:b/>
+          <w:bCs/>
+          <w:i w:val="false"/>
+          <w:iCs w:val="false"/>
+          <w:color w:val="24303F"/>
+          <w:sz w:val="20"/>
+          <w:szCs w:val="20"/>
+        </w:rPr>
+        <w:t xml:space="preserve">Branding depth. </w:t>
+      </w:r>
+      <w:r>
+        <w:rPr>
+          <w:rFonts w:ascii="Calibri" w:cs="Calibri" w:eastAsia="Calibri" w:hAnsi="Calibri"/>
+          <w:b w:val="false"/>
+          <w:bCs w:val="false"/>
+          <w:i w:val="false"/>
+          <w:iCs w:val="false"/>
+          <w:color w:val="24303F"/>
+          <w:sz w:val="20"/>
+          <w:szCs w:val="20"/>
+        </w:rPr>
+        <w:t xml:space="preserve">Does the client ever see the vendor? Some “white-label” tiers only swap a logo while the real name still shows in the dashboard, the billing or the support emails. Ask to see the branded product working before you trust the word.</w:t>
+      </w:r>
+    </w:p>
+    <w:p>
+      <w:pPr>
+        <w:pStyle w:val="ListParagraph"/>
+        <w:numPr>
+          <w:ilvl w:val="0"/>
+          <w:numId w:val="1"/>
+        </w:numPr>
+        <w:spacing w:after="50" w:line="272"/>
+      </w:pPr>
+      <w:r>
+        <w:rPr>
+          <w:rFonts w:ascii="Calibri" w:cs="Calibri" w:eastAsia="Calibri" w:hAnsi="Calibri"/>
+          <w:b/>
+          <w:bCs/>
+          <w:i w:val="false"/>
+          <w:iCs w:val="false"/>
+          <w:color w:val="24303F"/>
+          <w:sz w:val="20"/>
+          <w:szCs w:val="20"/>
+        </w:rPr>
+        <w:t xml:space="preserve">Who owns the client and the data. </w:t>
+      </w:r>
+      <w:r>
+        <w:rPr>
+          <w:rFonts w:ascii="Calibri" w:cs="Calibri" w:eastAsia="Calibri" w:hAnsi="Calibri"/>
+          <w:b w:val="false"/>
+          <w:bCs w:val="false"/>
+          <w:i w:val="false"/>
+          <w:iCs w:val="false"/>
+          <w:color w:val="24303F"/>
+          <w:sz w:val="20"/>
+          <w:szCs w:val="20"/>
+        </w:rPr>
+        <w:t xml:space="preserve">You should be able to keep and export both. If the vendor holds the relationship, you are renting your own clients.</w:t>
+      </w:r>
+    </w:p>
+    <w:p>
+      <w:pPr>
+        <w:pStyle w:val="ListParagraph"/>
+        <w:numPr>
+          <w:ilvl w:val="0"/>
+          <w:numId w:val="1"/>
+        </w:numPr>
+        <w:spacing w:after="50" w:line="272"/>
+      </w:pPr>
+      <w:r>
+        <w:rPr>
+          <w:rFonts w:ascii="Calibri" w:cs="Calibri" w:eastAsia="Calibri" w:hAnsi="Calibri"/>
+          <w:b/>
+          <w:bCs/>
+          <w:i w:val="false"/>
+          <w:iCs w:val="false"/>
+          <w:color w:val="24303F"/>
+          <w:sz w:val="20"/>
+          <w:szCs w:val="20"/>
+        </w:rPr>
+        <w:t xml:space="preserve">How usage is priced. </w:t>
+      </w:r>
+      <w:r>
+        <w:rPr>
+          <w:rFonts w:ascii="Calibri" w:cs="Calibri" w:eastAsia="Calibri" w:hAnsi="Calibri"/>
+          <w:b w:val="false"/>
+          <w:bCs w:val="false"/>
+          <w:i w:val="false"/>
+          <w:iCs w:val="false"/>
+          <w:color w:val="24303F"/>
+          <w:sz w:val="20"/>
+          <w:szCs w:val="20"/>
+        </w:rPr>
+        <w:t xml:space="preserve">Flat, per-seat, or usage-based. Usage-based is the one that quietly erodes a flat retail price as call volume climbs, so price your clients with a band, not a fixed fee you will regret at scale.</w:t>
+      </w:r>
+    </w:p>
+    <w:p>
+      <w:pPr>
+        <w:pStyle w:val="ListParagraph"/>
+        <w:numPr>
+          <w:ilvl w:val="0"/>
+          <w:numId w:val="1"/>
+        </w:numPr>
+        <w:spacing w:after="50" w:line="272"/>
+      </w:pPr>
+      <w:r>
+        <w:rPr>
+          <w:rFonts w:ascii="Calibri" w:cs="Calibri" w:eastAsia="Calibri" w:hAnsi="Calibri"/>
+          <w:b/>
+          <w:bCs/>
+          <w:i w:val="false"/>
+          <w:iCs w:val="false"/>
+          <w:color w:val="24303F"/>
+          <w:sz w:val="20"/>
+          <w:szCs w:val="20"/>
+        </w:rPr>
+        <w:t xml:space="preserve">Whether compliance is included or gated. </w:t>
+      </w:r>
+      <w:r>
+        <w:rPr>
+          <w:rFonts w:ascii="Calibri" w:cs="Calibri" w:eastAsia="Calibri" w:hAnsi="Calibri"/>
+          <w:b w:val="false"/>
+          <w:bCs w:val="false"/>
+          <w:i w:val="false"/>
+          <w:iCs w:val="false"/>
+          <w:color w:val="24303F"/>
+          <w:sz w:val="20"/>
+          <w:szCs w:val="20"/>
+        </w:rPr>
+        <w:t xml:space="preserve">This is where the field splits. Some platforms put HIPAA behind a paid add-on or a higher tier, and some skip it entirely. If your clients are regulated, that add-on is not optional, it is the product. Ours is included on every workspace.</w:t>
+      </w:r>
+    </w:p>
+    <w:p>
+      <w:pPr>
+        <w:pStyle w:val="ListParagraph"/>
+        <w:numPr>
+          <w:ilvl w:val="0"/>
+          <w:numId w:val="1"/>
+        </w:numPr>
+        <w:spacing w:after="50" w:line="272"/>
+      </w:pPr>
+      <w:r>
+        <w:rPr>
+          <w:rFonts w:ascii="Calibri" w:cs="Calibri" w:eastAsia="Calibri" w:hAnsi="Calibri"/>
+          <w:b/>
+          <w:bCs/>
+          <w:i w:val="false"/>
+          <w:iCs w:val="false"/>
+          <w:color w:val="24303F"/>
+          <w:sz w:val="20"/>
+          <w:szCs w:val="20"/>
+        </w:rPr>
+        <w:t xml:space="preserve">The call record. </w:t>
+      </w:r>
+      <w:r>
+        <w:rPr>
+          <w:rFonts w:ascii="Calibri" w:cs="Calibri" w:eastAsia="Calibri" w:hAnsi="Calibri"/>
+          <w:b w:val="false"/>
+          <w:bCs w:val="false"/>
+          <w:i w:val="false"/>
+          <w:iCs w:val="false"/>
+          <w:color w:val="24303F"/>
+          <w:sz w:val="20"/>
+          <w:szCs w:val="20"/>
+        </w:rPr>
+        <w:t xml:space="preserve">When a client disputes what the AI said, can you pull a verifiable recording and transcript of that exact call? If you cannot, the liability is yours with nothing to stand on.</w:t>
+      </w:r>
+    </w:p>
+    <w:p>
+      <w:pPr>
+        <w:spacing w:after="110" w:line="278"/>
+      </w:pPr>
+      <w:r>
+        <w:rPr>
+          <w:rFonts w:ascii="Calibri" w:cs="Calibri" w:eastAsia="Calibri" w:hAnsi="Calibri"/>
+          <w:b w:val="false"/>
+          <w:bCs w:val="false"/>
+          <w:i w:val="false"/>
+          <w:iCs w:val="false"/>
+          <w:color w:val="24303F"/>
+          <w:sz w:val="20"/>
+          <w:szCs w:val="20"/>
+        </w:rPr>
+        <w:t xml:space="preserve">For the platform-by-platform version of this, with each vendor scored on the same checks, see our </w:t>
+      </w:r>
+      <w:r>
+        <w:rPr>
+          <w:rFonts w:ascii="Calibri" w:cs="Calibri" w:eastAsia="Calibri" w:hAnsi="Calibri"/>
+          <w:color w:val="1B5E86"/>
+          <w:sz w:val="20"/>
+          <w:szCs w:val="20"/>
+          <w:u w:val="single"/>
+        </w:rPr>
+        <w:t xml:space="preserve">white-label voice AI comparison</w:t>
+      </w:r>
+      <w:r>
+        <w:rPr>
+          <w:rFonts w:ascii="Consolas" w:cs="Consolas" w:eastAsia="Consolas" w:hAnsi="Consolas"/>
+          <w:color w:val="5A6675"/>
+          <w:sz w:val="12"/>
+          <w:szCs w:val="12"/>
+        </w:rPr>
+        <w:t xml:space="preserve"> [/blogs/best-white-label-voice-ai]</w:t>
+      </w:r>
+      <w:r>
+        <w:rPr>
+          <w:rFonts w:ascii="Calibri" w:cs="Calibri" w:eastAsia="Calibri" w:hAnsi="Calibri"/>
+          <w:b w:val="false"/>
+          <w:bCs w:val="false"/>
+          <w:i w:val="false"/>
+          <w:iCs w:val="false"/>
+          <w:color w:val="24303F"/>
+          <w:sz w:val="20"/>
+          <w:szCs w:val="20"/>
+        </w:rPr>
+        <w:t xml:space="preserve">.</w:t>
+      </w:r>
+    </w:p>
+    <w:p>
+      <w:pPr>
+        <w:spacing w:after="30" w:before="120"/>
+      </w:pPr>
+      <w:r>
+        <w:rPr>
+          <w:rFonts w:ascii="Consolas" w:cs="Consolas" w:eastAsia="Consolas" w:hAnsi="Consolas"/>
+          <w:b/>
+          <w:bCs/>
+          <w:color w:val="9A6B3F"/>
+          <w:spacing w:val="12"/>
+          <w:sz w:val="14"/>
+          <w:szCs w:val="14"/>
+        </w:rPr>
         <w:t xml:space="preserve">SECTION 5 · YOUR MARGIN  (KEEP THE CALCULATOR)</w:t>
       </w:r>
     </w:p>
@@ -1410,7 +1595,7 @@
           <w:sz w:val="20"/>
           <w:szCs w:val="20"/>
         </w:rPr>
-        <w:t xml:space="preserve">Set your own price and keep the gap. Usage is a flat $0.12 a minute and covers the platform, speech-to-text, the model and text-to-speech; telephony is separate, from $0.014 a minute on US Trillet numbers, with no telephony fee on web calls. Priced sensibly, agencies hold margins in the 70s. In the platform's own example, five clients on a $300 monthly retainer, at roughly two-minute calls, returns about a 74 per cent margin on the Agency plan.</w:t>
+        <w:t xml:space="preserve">Set your own price and keep the gap. Usage is a flat $0.12 a minute and covers the platform, speech-to-text, the model and text-to-speech; telephony is separate, from $0.014 a minute on US Trillet numbers, with no telephony fee on web calls. Priced sensibly, agencies hold margins in the 70s. In our own worked example, five clients on a $300 monthly retainer, at roughly two-minute calls, returns about a 74 per cent margin on the Agency plan.</w:t>
       </w:r>
     </w:p>
     <w:p>
@@ -1428,7 +1613,7 @@
           <w:sz w:val="20"/>
           <w:szCs w:val="20"/>
         </w:rPr>
-        <w:t xml:space="preserve">Deeper working belongs on the money page, linked, not restated here: </w:t>
+        <w:t xml:space="preserve">The deeper working lives on the money page, linked, not restated here: </w:t>
       </w:r>
       <w:r>
         <w:rPr>
@@ -2244,7 +2429,7 @@
           <w:sz w:val="18"/>
           <w:szCs w:val="18"/>
         </w:rPr>
-        <w:t xml:space="preserve">Keep the trust bar (1,200+ businesses) and the support block, but condense the support block to three lines so it does not compete with compliance for attention: playbooks and templates, coaching and a partner community, and co-delivery on larger deployments with Trillet as the compliance and infrastructure partner.</w:t>
+        <w:t xml:space="preserve">Keep the trust bar (1,200+ businesses) and the support block, but condense the support block to three lines so it does not compete with compliance for attention: playbooks and templates you can reuse, coaching and a partner community, and co-delivery on larger deployments with us as your compliance and infrastructure partner.</w:t>
       </w:r>
     </w:p>
     <w:p>
@@ -2260,7 +2445,7 @@
           <w:sz w:val="25"/>
           <w:szCs w:val="25"/>
         </w:rPr>
-        <w:t xml:space="preserve">FAQ  (reconciled + head-term coverage)</w:t>
+        <w:t xml:space="preserve">FAQ  (definition folded in + head-term coverage)</w:t>
       </w:r>
     </w:p>
     <w:p>
@@ -2278,7 +2463,7 @@
           <w:sz w:val="17"/>
           <w:szCs w:val="17"/>
         </w:rPr>
-        <w:t xml:space="preserve">Keep the six live answers, which are strong, and add one at the top that owns the definition query. Question wording matches how people and engines phrase it.</w:t>
+        <w:t xml:space="preserve">The definition that used to sit in the body now opens the FAQ, where it belongs. Question wording matches how people and engines phrase it; answers are in the team's voice.</w:t>
       </w:r>
     </w:p>
     <w:p>
@@ -2312,7 +2497,7 @@
           <w:sz w:val="20"/>
           <w:szCs w:val="20"/>
         </w:rPr>
-        <w:t xml:space="preserve">A voice agent platform you resell under your own brand. You pay a wholesale rate, put your name, domain and dashboard on it, set your own price, and own the client. The vendor runs the software and stays invisible. Trillet adds built-in compliance and a verifiable record of every call.</w:t>
+        <w:t xml:space="preserve">A voice agent platform you resell under your own brand. You pay a wholesale rate, put your name, domain and dashboard on it, set your own price, and own the client. The vendor runs the software and stays invisible. With Trillet, compliance and a verifiable record of every call come built in.</w:t>
       </w:r>
     </w:p>
     <w:p>
@@ -2346,7 +2531,7 @@
           <w:sz w:val="20"/>
           <w:szCs w:val="20"/>
         </w:rPr>
-        <w:t xml:space="preserve">Yes. You run Trillet under your own domain and branding, with client-facing dashboards that look like your own product. The platform stays behind the scenes, so you sell and manage voice AI as your own offering.</w:t>
+        <w:t xml:space="preserve">Yes. You run Trillet under your own domain and branding, with client-facing dashboards that look like your own product. We stay behind the scenes, so you sell and manage voice AI as your own offering.</w:t>
       </w:r>
     </w:p>
     <w:p>
@@ -2380,7 +2565,7 @@
           <w:sz w:val="20"/>
           <w:szCs w:val="20"/>
         </w:rPr>
-        <w:t xml:space="preserve">No. Clients keep their existing numbers. Trillet uses carrier-level call forwarding rather than porting, so setup takes about 30 seconds and the experience stays seamless.</w:t>
+        <w:t xml:space="preserve">No. Clients keep their existing numbers. We use carrier-level call forwarding rather than porting, so setup takes about 30 seconds and the experience stays seamless.</w:t>
       </w:r>
     </w:p>
     <w:p>
@@ -2482,7 +2667,7 @@
           <w:sz w:val="20"/>
           <w:szCs w:val="20"/>
         </w:rPr>
-        <w:t xml:space="preserve">Yes. SOC 2 Type II and ISO 27001, and operation under HIPAA, GDPR, ACMA and TCPA, with audit trails on every workspace and onshore data residency. On-premise and private cloud are available for enterprise.</w:t>
+        <w:t xml:space="preserve">Yes, and it is included, not an add-on. SOC 2 Type II and ISO 27001, and operation under HIPAA, GDPR, ACMA and TCPA, with audit trails on every workspace and onshore data residency. On-premise and private cloud are available for enterprise.</w:t>
       </w:r>
     </w:p>
     <w:p>
@@ -2600,7 +2785,7 @@
           <w:sz w:val="20"/>
           <w:szCs w:val="20"/>
         </w:rPr>
-        <w:t xml:space="preserve">Start on the platform today. Your branding, your pricing, your client relationships. If you want a formal reseller, referral or OEM arrangement, the </w:t>
+        <w:t xml:space="preserve">Start on the platform today. Your branding, your pricing, your client relationships. If you want a formal reseller, referral or OEM arrangement, our </w:t>
       </w:r>
       <w:r>
         <w:rPr>
@@ -3482,7 +3667,7 @@
                 <w:sz w:val="13"/>
                 <w:szCs w:val="13"/>
               </w:rPr>
-              <w:t xml:space="preserve">partner program (reseller / referral / OEM)</w:t>
+              <w:t xml:space="preserve">white-label voice AI comparison</w:t>
             </w:r>
           </w:p>
         </w:tc>
@@ -3516,7 +3701,7 @@
                 <w:sz w:val="13"/>
                 <w:szCs w:val="13"/>
               </w:rPr>
-              <w:t xml:space="preserve">/partners</w:t>
+              <w:t xml:space="preserve">/blogs/best-white-label-voice-ai</w:t>
             </w:r>
           </w:p>
         </w:tc>
@@ -3552,7 +3737,7 @@
                 <w:sz w:val="13"/>
                 <w:szCs w:val="13"/>
               </w:rPr>
-              <w:t xml:space="preserve">healthcare voice AI</w:t>
+              <w:t xml:space="preserve">partner program (reseller / referral / OEM)</w:t>
             </w:r>
           </w:p>
         </w:tc>
@@ -3586,7 +3771,7 @@
                 <w:sz w:val="13"/>
                 <w:szCs w:val="13"/>
               </w:rPr>
-              <w:t xml:space="preserve">(vertical page)</w:t>
+              <w:t xml:space="preserve">/partners</w:t>
             </w:r>
           </w:p>
         </w:tc>
@@ -3622,7 +3807,7 @@
                 <w:sz w:val="13"/>
                 <w:szCs w:val="13"/>
               </w:rPr>
-              <w:t xml:space="preserve">legal voice AI</w:t>
+              <w:t xml:space="preserve">healthcare voice AI</w:t>
             </w:r>
           </w:p>
         </w:tc>
@@ -3692,7 +3877,7 @@
                 <w:sz w:val="13"/>
                 <w:szCs w:val="13"/>
               </w:rPr>
-              <w:t xml:space="preserve">financial services voice AI</w:t>
+              <w:t xml:space="preserve">legal voice AI</w:t>
             </w:r>
           </w:p>
         </w:tc>
@@ -3762,7 +3947,7 @@
                 <w:sz w:val="13"/>
                 <w:szCs w:val="13"/>
               </w:rPr>
-              <w:t xml:space="preserve">compare white-label voice AI</w:t>
+              <w:t xml:space="preserve">financial services voice AI</w:t>
             </w:r>
           </w:p>
         </w:tc>
@@ -3796,7 +3981,7 @@
                 <w:sz w:val="13"/>
                 <w:szCs w:val="13"/>
               </w:rPr>
-              <w:t xml:space="preserve">/blogs/best-white-label-voice-ai</w:t>
+              <w:t xml:space="preserve">(vertical page)</w:t>
             </w:r>
           </w:p>
         </w:tc>
@@ -4252,7 +4437,7 @@
           <w:sz w:val="17"/>
           <w:szCs w:val="17"/>
         </w:rPr>
-        <w:t xml:space="preserve">The Service node is the one the live page is missing. It tells an engine the page is an offering called white-label voice AI, priced, from a named provider, which is exactly the entity the head term describes.</w:t>
+        <w:t xml:space="preserve">The Service node is the one the live page is missing. It tells an engine the page is an offering called white-label voice AI, priced, from a named provider, which is exactly the entity the head term describes. The checklist can also carry HowTo or ItemList markup if you want it eligible for a list snippet.</w:t>
       </w:r>
     </w:p>
     <w:p>
@@ -4279,7 +4464,7 @@
           <w:sz w:val="25"/>
           <w:szCs w:val="25"/>
         </w:rPr>
-        <w:t xml:space="preserve">What changed from the live page, in one list</w:t>
+        <w:t xml:space="preserve">What changed in this final, in one list</w:t>
       </w:r>
     </w:p>
     <w:p>
@@ -4302,7 +4487,7 @@
           <w:sz w:val="20"/>
           <w:szCs w:val="20"/>
         </w:rPr>
-        <w:t xml:space="preserve">H1 now carries the head term “white-label voice AI” instead of implying it.</w:t>
+        <w:t xml:space="preserve">Rewritten in the team's voice throughout: we build it, we have sold it. Authority, not brochure copy.</w:t>
       </w:r>
     </w:p>
     <w:p>
@@ -4325,7 +4510,7 @@
           <w:sz w:val="20"/>
           <w:szCs w:val="20"/>
         </w:rPr>
-        <w:t xml:space="preserve">New answer block under the hero defines the term for readers and AI engines, with Trillet named.</w:t>
+        <w:t xml:space="preserve">The “what is white-label voice AI” body block is removed (it read as filler) and folded into the FAQ as the opening question.</w:t>
       </w:r>
     </w:p>
     <w:p>
@@ -4348,7 +4533,7 @@
           <w:sz w:val="20"/>
           <w:szCs w:val="20"/>
         </w:rPr>
-        <w:t xml:space="preserve">Compliance moved up from the foot to above pricing, framed as the wedge, not fine print.</w:t>
+        <w:t xml:space="preserve">New buyer's checklist section, grounded in real evaluation intent and the competitor review, with compliance framed as a buying criterion.</w:t>
       </w:r>
     </w:p>
     <w:p>
@@ -4371,7 +4556,7 @@
           <w:sz w:val="20"/>
           <w:szCs w:val="20"/>
         </w:rPr>
-        <w:t xml:space="preserve">Meta description rewritten from 186 to 152 characters, head term first, compliance last.</w:t>
+        <w:t xml:space="preserve">Feature grid enriched: each card now describes the thing concretely (isolated data, paste-a-site build, branded reports) instead of naming it.</w:t>
       </w:r>
     </w:p>
     <w:p>
@@ -4394,7 +4579,7 @@
           <w:sz w:val="20"/>
           <w:szCs w:val="20"/>
         </w:rPr>
-        <w:t xml:space="preserve">Question-format FAQ gains a definition question at the top; existing answers kept and reconciled.</w:t>
+        <w:t xml:space="preserve">H1 carries the head term; compliance moved above pricing and written first person; meta description trimmed 186 to 152 characters.</w:t>
       </w:r>
     </w:p>
     <w:p>
@@ -4417,7 +4602,7 @@
           <w:sz w:val="20"/>
           <w:szCs w:val="20"/>
         </w:rPr>
-        <w:t xml:space="preserve">Service JSON-LD added so the page reads as a named, priced offering.</w:t>
+        <w:t xml:space="preserve">Service JSON-LD added; internal-link map now also points down to the comparison roundup.</w:t>
       </w:r>
     </w:p>
     <w:p>
@@ -4440,30 +4625,7 @@
           <w:sz w:val="20"/>
           <w:szCs w:val="20"/>
         </w:rPr>
-        <w:t xml:space="preserve">Internal-link map wires every consolidating spoke up to the hub and the hub down to money and vertical pages.</w:t>
-      </w:r>
-    </w:p>
-    <w:p>
-      <w:pPr>
-        <w:pStyle w:val="ListParagraph"/>
-        <w:numPr>
-          <w:ilvl w:val="0"/>
-          <w:numId w:val="1"/>
-        </w:numPr>
-        <w:spacing w:after="50" w:line="272"/>
-      </w:pPr>
-      <w:r>
-        <w:rPr>
-          <w:rFonts w:ascii="Calibri" w:cs="Calibri" w:eastAsia="Calibri" w:hAnsi="Calibri"/>
-          <w:b w:val="false"/>
-          <w:bCs w:val="false"/>
-          <w:i w:val="false"/>
-          <w:iCs w:val="false"/>
-          <w:color w:val="24303F"/>
-          <w:sz w:val="20"/>
-          <w:szCs w:val="20"/>
-        </w:rPr>
-        <w:t xml:space="preserve">Everything else on the live page kept. Pricing, margin calculator, verticals, proof and support are strong; they stay.</w:t>
+        <w:t xml:space="preserve">Everything strong on the live page kept: pricing, margin calculator, verticals, proof and support.</w:t>
       </w:r>
     </w:p>
     <w:sectPr>

</xml_diff>

<commit_message>
Correct Trillet white-label facts across Blog 3, Blog 4 and the hub page
Re-verified against live trillet.ai/whitelabel and /pricing (26 Sep 2026): the
white-label plans include 1,000 (Studio) and 3,000 (Agency) minutes, carry a
7-day free trial (not a 28-day money-back guarantee, which belongs to the 9
AI Receptionist plan), and social proof is 3,900+ businesses at 4.6 on
Trustpilot. Fix the stale 100/300 minutes, 28-day guarantee and 1,200+ figures
that had been carried from an earlier scrape.

Co-Authored-By: Claude Opus 4.8 <noreply@anthropic.com>
Claude-Session: https://claude.ai/code/session_01UhVChLeNNjFDr6eASTMGhh
</commit_message>
<xml_diff>
--- a/seo-audit/Trillet-Whitelabel-Hub-Rebuild.docx
+++ b/seo-audit/Trillet-Whitelabel-Hub-Rebuild.docx
@@ -554,7 +554,7 @@
           <w:sz w:val="19"/>
           <w:szCs w:val="19"/>
         </w:rPr>
-        <w:t xml:space="preserve">1,200+ businesses run on Trillet.</w:t>
+        <w:t xml:space="preserve">3,900+ businesses run on Trillet, rated 4.6 on Trustpilot.</w:t>
       </w:r>
       <w:r>
         <w:rPr>
@@ -1918,7 +1918,7 @@
                 <w:sz w:val="13"/>
                 <w:szCs w:val="13"/>
               </w:rPr>
-              <w:t xml:space="preserve">100 / month</w:t>
+              <w:t xml:space="preserve">1,000 / month</w:t>
             </w:r>
           </w:p>
         </w:tc>
@@ -1952,7 +1952,7 @@
                 <w:sz w:val="13"/>
                 <w:szCs w:val="13"/>
               </w:rPr>
-              <w:t xml:space="preserve">300 / month</w:t>
+              <w:t xml:space="preserve">3,000 / month</w:t>
             </w:r>
           </w:p>
         </w:tc>
@@ -2077,7 +2077,7 @@
           <w:sz w:val="17"/>
           <w:szCs w:val="17"/>
         </w:rPr>
-        <w:t xml:space="preserve">28-day money-back guarantee, no questions asked. No contracts, cancel anytime.</w:t>
+        <w:t xml:space="preserve">7-day free trial. No contracts, cancel anytime. (The 28-day money-back guarantee is the AI Receptionist plan, not white-label.)</w:t>
       </w:r>
     </w:p>
     <w:p>
@@ -2156,7 +2156,7 @@
           <w:sz w:val="17"/>
           <w:szCs w:val="17"/>
         </w:rPr>
-        <w:t xml:space="preserve">Two or three short agency quotes with name, agency and a number (clients signed, margin, launch time). If real testimonials are not ready, use a logo wall plus the 1,200+ figure rather than inventing quotes.</w:t>
+        <w:t xml:space="preserve">Two or three short agency quotes with name, agency and a number (clients signed, margin, launch time). If real testimonials are not ready, use a logo wall plus the 3,900+ figure rather than inventing quotes.</w:t>
       </w:r>
     </w:p>
     <w:tbl>
@@ -3563,7 +3563,7 @@
                 <w:sz w:val="13"/>
                 <w:szCs w:val="13"/>
               </w:rPr>
-              <w:t xml:space="preserve">1,200+ businesses and compliance badges, instant credibility</w:t>
+              <w:t xml:space="preserve">3,900+ businesses, 4.6 Trustpilot and compliance badges, instant credibility</w:t>
             </w:r>
           </w:p>
         </w:tc>

</xml_diff>